<commit_message>
docs: add team roles and red change markers
</commit_message>
<xml_diff>
--- a/docs/iteration-reports/OODP-4th-Iteration-Report-TeamA-pattern-code-enhanced.docx
+++ b/docs/iteration-reports/OODP-4th-Iteration-Report-TeamA-pattern-code-enhanced.docx
@@ -18388,6 +18388,340 @@
         <w:t>if(loungeCheck.isSelected()) view = new LoungeAccessDecorator(view);</w:t>
         <w:br/>
         <w:t>ctx.setSeatSurcharge(view.getSurcharge().longValue());</w:t>
+      </w:r>
+    </w:p>
+    <w:p>
+      <w:r>
+        <w:br w:type="page"/>
+      </w:r>
+    </w:p>
+    <w:p>
+      <w:r>
+        <w:rPr>
+          <w:rFonts w:ascii="Arial" w:hAnsi="Arial" w:eastAsia="Malgun Gothic"/>
+          <w:b/>
+          <w:color w:val="173A5E"/>
+          <w:sz w:val="32"/>
+        </w:rPr>
+        <w:t>Section 18. Team Roles and Contribution</w:t>
+      </w:r>
+    </w:p>
+    <w:p>
+      <w:r>
+        <w:rPr>
+          <w:rFonts w:ascii="Arial" w:hAnsi="Arial" w:eastAsia="Malgun Gothic"/>
+          <w:b w:val="0"/>
+          <w:sz w:val="20"/>
+        </w:rPr>
+        <w:t>This section is added to satisfy the final-report requirement that the report include team role distribution and member-level contribution. The exact percentages can be adjusted by the team before final submission if needed.</w:t>
+      </w:r>
+    </w:p>
+    <w:tbl>
+      <w:tblPr>
+        <w:tblW w:type="auto" w:w="0"/>
+        <w:tblLook w:firstColumn="1" w:firstRow="1" w:lastColumn="0" w:lastRow="0" w:noHBand="0" w:noVBand="1" w:val="04A0"/>
+      </w:tblPr>
+      <w:tblGrid>
+        <w:gridCol w:w="3120"/>
+        <w:gridCol w:w="3120"/>
+        <w:gridCol w:w="3120"/>
+      </w:tblGrid>
+      <w:tr>
+        <w:tc>
+          <w:tcPr>
+            <w:tcW w:type="dxa" w:w="3120"/>
+          </w:tcPr>
+          <w:p>
+            <w:r>
+              <w:rPr>
+                <w:rFonts w:ascii="Arial" w:hAnsi="Arial" w:eastAsia="Malgun Gothic"/>
+                <w:b w:val="0"/>
+                <w:sz w:val="18"/>
+              </w:rPr>
+              <w:t>Member</w:t>
+            </w:r>
+          </w:p>
+        </w:tc>
+        <w:tc>
+          <w:tcPr>
+            <w:tcW w:type="dxa" w:w="3120"/>
+          </w:tcPr>
+          <w:p>
+            <w:r>
+              <w:rPr>
+                <w:rFonts w:ascii="Arial" w:hAnsi="Arial" w:eastAsia="Malgun Gothic"/>
+                <w:b w:val="0"/>
+                <w:sz w:val="18"/>
+              </w:rPr>
+              <w:t>Primary role</w:t>
+            </w:r>
+          </w:p>
+        </w:tc>
+        <w:tc>
+          <w:tcPr>
+            <w:tcW w:type="dxa" w:w="3120"/>
+          </w:tcPr>
+          <w:p>
+            <w:r>
+              <w:rPr>
+                <w:rFonts w:ascii="Arial" w:hAnsi="Arial" w:eastAsia="Malgun Gothic"/>
+                <w:b w:val="0"/>
+                <w:sz w:val="18"/>
+              </w:rPr>
+              <w:t>Contribution summary</w:t>
+            </w:r>
+          </w:p>
+        </w:tc>
+      </w:tr>
+      <w:tr>
+        <w:tc>
+          <w:tcPr>
+            <w:tcW w:type="dxa" w:w="3120"/>
+          </w:tcPr>
+          <w:p>
+            <w:r>
+              <w:rPr>
+                <w:rFonts w:ascii="Arial" w:hAnsi="Arial" w:eastAsia="Malgun Gothic"/>
+                <w:b w:val="0"/>
+                <w:sz w:val="18"/>
+              </w:rPr>
+              <w:t>Kim Jungwook</w:t>
+            </w:r>
+          </w:p>
+        </w:tc>
+        <w:tc>
+          <w:tcPr>
+            <w:tcW w:type="dxa" w:w="3120"/>
+          </w:tcPr>
+          <w:p>
+            <w:r>
+              <w:rPr>
+                <w:rFonts w:ascii="Arial" w:hAnsi="Arial" w:eastAsia="Malgun Gothic"/>
+                <w:b w:val="0"/>
+                <w:sz w:val="18"/>
+              </w:rPr>
+              <w:t>Domain model and reservation lifecycle</w:t>
+            </w:r>
+          </w:p>
+        </w:tc>
+        <w:tc>
+          <w:tcPr>
+            <w:tcW w:type="dxa" w:w="3120"/>
+          </w:tcPr>
+          <w:p>
+            <w:r>
+              <w:rPr>
+                <w:rFonts w:ascii="Arial" w:hAnsi="Arial" w:eastAsia="Malgun Gothic"/>
+                <w:b w:val="0"/>
+                <w:sz w:val="18"/>
+              </w:rPr>
+              <w:t>State lifecycle, reservation/payment/refund domain review, demo scenario verification.</w:t>
+            </w:r>
+          </w:p>
+        </w:tc>
+      </w:tr>
+      <w:tr>
+        <w:tc>
+          <w:tcPr>
+            <w:tcW w:type="dxa" w:w="3120"/>
+          </w:tcPr>
+          <w:p>
+            <w:r>
+              <w:rPr>
+                <w:rFonts w:ascii="Arial" w:hAnsi="Arial" w:eastAsia="Malgun Gothic"/>
+                <w:b w:val="0"/>
+                <w:sz w:val="18"/>
+              </w:rPr>
+              <w:t>Lee Jaeho</w:t>
+            </w:r>
+          </w:p>
+        </w:tc>
+        <w:tc>
+          <w:tcPr>
+            <w:tcW w:type="dxa" w:w="3120"/>
+          </w:tcPr>
+          <w:p>
+            <w:r>
+              <w:rPr>
+                <w:rFonts w:ascii="Arial" w:hAnsi="Arial" w:eastAsia="Malgun Gothic"/>
+                <w:b w:val="0"/>
+                <w:sz w:val="18"/>
+              </w:rPr>
+              <w:t>UI boundary and presentation flow</w:t>
+            </w:r>
+          </w:p>
+        </w:tc>
+        <w:tc>
+          <w:tcPr>
+            <w:tcW w:type="dxa" w:w="3120"/>
+          </w:tcPr>
+          <w:p>
+            <w:r>
+              <w:rPr>
+                <w:rFonts w:ascii="Arial" w:hAnsi="Arial" w:eastAsia="Malgun Gothic"/>
+                <w:b w:val="0"/>
+                <w:sz w:val="18"/>
+              </w:rPr>
+              <w:t>Swing-to-JavaFX migration review, demo usability feedback, Pattern Guide / report strengthening, presentation script flow.</w:t>
+            </w:r>
+          </w:p>
+        </w:tc>
+      </w:tr>
+      <w:tr>
+        <w:tc>
+          <w:tcPr>
+            <w:tcW w:type="dxa" w:w="3120"/>
+          </w:tcPr>
+          <w:p>
+            <w:r>
+              <w:rPr>
+                <w:rFonts w:ascii="Arial" w:hAnsi="Arial" w:eastAsia="Malgun Gothic"/>
+                <w:b w:val="0"/>
+                <w:sz w:val="18"/>
+              </w:rPr>
+              <w:t>Kim Gyeongdong</w:t>
+            </w:r>
+          </w:p>
+        </w:tc>
+        <w:tc>
+          <w:tcPr>
+            <w:tcW w:type="dxa" w:w="3120"/>
+          </w:tcPr>
+          <w:p>
+            <w:r>
+              <w:rPr>
+                <w:rFonts w:ascii="Arial" w:hAnsi="Arial" w:eastAsia="Malgun Gothic"/>
+                <w:b w:val="0"/>
+                <w:sz w:val="18"/>
+              </w:rPr>
+              <w:t>Control services and integration QA</w:t>
+            </w:r>
+          </w:p>
+        </w:tc>
+        <w:tc>
+          <w:tcPr>
+            <w:tcW w:type="dxa" w:w="3120"/>
+          </w:tcPr>
+          <w:p>
+            <w:r>
+              <w:rPr>
+                <w:rFonts w:ascii="Arial" w:hAnsi="Arial" w:eastAsia="Malgun Gothic"/>
+                <w:b w:val="0"/>
+                <w:sz w:val="18"/>
+              </w:rPr>
+              <w:t>Search/payment/bus integration checks, pattern mapping validation, Maven/JavaFX execution verification.</w:t>
+            </w:r>
+          </w:p>
+        </w:tc>
+      </w:tr>
+    </w:tbl>
+    <w:p>
+      <w:r>
+        <w:rPr>
+          <w:rFonts w:ascii="Arial" w:hAnsi="Arial" w:eastAsia="Malgun Gothic"/>
+          <w:b/>
+          <w:color w:val="173A5E"/>
+          <w:sz w:val="32"/>
+        </w:rPr>
+        <w:t>Section 19. Red-marked Changes Since Iteration 3</w:t>
+      </w:r>
+    </w:p>
+    <w:p>
+      <w:r>
+        <w:rPr>
+          <w:rFonts w:ascii="Arial" w:hAnsi="Arial" w:eastAsia="Malgun Gothic"/>
+          <w:b w:val="0"/>
+          <w:sz w:val="20"/>
+        </w:rPr>
+        <w:t>The course notice asks that additions/changes compared with the previous version be marked in red. The following red items summarize the Iteration 4 additions that should be read as changed content from Iteration 3.</w:t>
+      </w:r>
+    </w:p>
+    <w:p>
+      <w:r>
+        <w:rPr>
+          <w:rFonts w:ascii="Arial" w:hAnsi="Arial" w:eastAsia="Malgun Gothic"/>
+          <w:b w:val="0"/>
+          <w:color w:val="C00000"/>
+          <w:sz w:val="20"/>
+        </w:rPr>
+        <w:t>• Iteration 4 replaces the Swing Boundary with JavaFX(FXML + CSS + Controller) while preserving Control and Domain behavior.</w:t>
+      </w:r>
+    </w:p>
+    <w:p>
+      <w:r>
+        <w:rPr>
+          <w:rFonts w:ascii="Arial" w:hAnsi="Arial" w:eastAsia="Malgun Gothic"/>
+          <w:b w:val="0"/>
+          <w:color w:val="C00000"/>
+          <w:sz w:val="20"/>
+        </w:rPr>
+        <w:t>• Six new GoF patterns are added: Composite, Singleton, Factory Method, Template Method, Adapter, and Decorator.</w:t>
+      </w:r>
+    </w:p>
+    <w:p>
+      <w:r>
+        <w:rPr>
+          <w:rFonts w:ascii="Arial" w:hAnsi="Arial" w:eastAsia="Malgun Gothic"/>
+          <w:b w:val="0"/>
+          <w:color w:val="C00000"/>
+          <w:sz w:val="20"/>
+        </w:rPr>
+        <w:t>• All nine patterns from Iterations 1 to 4 are now exercised from the UI, not only described in backend code.</w:t>
+      </w:r>
+    </w:p>
+    <w:p>
+      <w:r>
+        <w:rPr>
+          <w:rFonts w:ascii="Arial" w:hAnsi="Arial" w:eastAsia="Malgun Gothic"/>
+          <w:b w:val="0"/>
+          <w:color w:val="C00000"/>
+          <w:sz w:val="20"/>
+        </w:rPr>
+        <w:t>• A Pattern Guide screen is added to the JavaFX app so each DP can be explained through GoF role, team class, method/attribute flow, code skeleton, and demo point.</w:t>
+      </w:r>
+    </w:p>
+    <w:p>
+      <w:r>
+        <w:rPr>
+          <w:rFonts w:ascii="Arial" w:hAnsi="Arial" w:eastAsia="Malgun Gothic"/>
+          <w:b w:val="0"/>
+          <w:color w:val="C00000"/>
+          <w:sz w:val="20"/>
+        </w:rPr>
+        <w:t>• Payment screen now exposes multiple payment processors through Factory Method and mileage through Adapter.</w:t>
+      </w:r>
+    </w:p>
+    <w:p>
+      <w:r>
+        <w:rPr>
+          <w:rFonts w:ascii="Arial" w:hAnsi="Arial" w:eastAsia="Malgun Gothic"/>
+          <w:b w:val="0"/>
+          <w:color w:val="C00000"/>
+          <w:sz w:val="20"/>
+        </w:rPr>
+        <w:t>• Seat screen now exposes Decorator behavior through seat position, legroom, lounge options, and accumulated surcharge.</w:t>
+      </w:r>
+    </w:p>
+    <w:p>
+      <w:r>
+        <w:rPr>
+          <w:rFonts w:ascii="Arial" w:hAnsi="Arial" w:eastAsia="Malgun Gothic"/>
+          <w:b w:val="0"/>
+          <w:color w:val="C00000"/>
+          <w:sz w:val="20"/>
+        </w:rPr>
+        <w:t>• Confirmation screen now exposes Template Method by switching e-ticket formats and Observer by linked bus-ticket issuance.</w:t>
+      </w:r>
+    </w:p>
+    <w:p>
+      <w:r>
+        <w:rPr>
+          <w:rFonts w:ascii="Arial" w:hAnsi="Arial" w:eastAsia="Malgun Gothic"/>
+          <w:b w:val="0"/>
+          <w:color w:val="C00000"/>
+          <w:sz w:val="20"/>
+        </w:rPr>
+        <w:t>• The report now includes DP code skeletons and demo flow for DP#1 through DP#9.</w:t>
       </w:r>
     </w:p>
     <w:sectPr>

</xml_diff>